<commit_message>
Code changes after jenkins configuration
</commit_message>
<xml_diff>
--- a/Information.docx
+++ b/Information.docx
@@ -4079,8 +4079,191 @@
           </wp:inline>
         </w:drawing>
       </w:r>
+    </w:p>
+    <w:p>
+      <w:pPr>
+        <w:ind w:left="360"/>
+        <w:rPr>
+          <w:rFonts w:ascii="Segoe UI" w:hAnsi="Segoe UI" w:cs="Segoe UI"/>
+          <w:sz w:val="20"/>
+          <w:szCs w:val="20"/>
+          <w:lang w:val="en-US"/>
+        </w:rPr>
+      </w:pPr>
+    </w:p>
+    <w:p>
+      <w:pPr>
+        <w:ind w:left="360"/>
+        <w:rPr>
+          <w:rFonts w:ascii="Segoe UI" w:hAnsi="Segoe UI" w:cs="Segoe UI"/>
+          <w:b/>
+          <w:sz w:val="36"/>
+          <w:szCs w:val="36"/>
+          <w:lang w:val="en-US"/>
+        </w:rPr>
+      </w:pPr>
+      <w:r>
+        <w:rPr>
+          <w:rFonts w:ascii="Segoe UI" w:hAnsi="Segoe UI" w:cs="Segoe UI"/>
+          <w:b/>
+          <w:sz w:val="36"/>
+          <w:szCs w:val="36"/>
+          <w:lang w:val="en-US"/>
+        </w:rPr>
+        <w:t>Jenkins:</w:t>
+      </w:r>
+    </w:p>
+    <w:p>
+      <w:pPr>
+        <w:ind w:left="360"/>
+        <w:rPr>
+          <w:rFonts w:ascii="Segoe UI" w:hAnsi="Segoe UI" w:cs="Segoe UI"/>
+          <w:sz w:val="24"/>
+          <w:szCs w:val="24"/>
+          <w:lang w:val="en-US"/>
+        </w:rPr>
+      </w:pPr>
+      <w:proofErr w:type="gramStart"/>
+      <w:r>
+        <w:rPr>
+          <w:rFonts w:ascii="Segoe UI" w:hAnsi="Segoe UI" w:cs="Segoe UI"/>
+          <w:sz w:val="24"/>
+          <w:szCs w:val="24"/>
+          <w:lang w:val="en-US"/>
+        </w:rPr>
+        <w:t>Ref :</w:t>
+      </w:r>
+      <w:proofErr w:type="gramEnd"/>
+      <w:r>
+        <w:rPr>
+          <w:rFonts w:ascii="Segoe UI" w:hAnsi="Segoe UI" w:cs="Segoe UI"/>
+          <w:sz w:val="24"/>
+          <w:szCs w:val="24"/>
+          <w:lang w:val="en-US"/>
+        </w:rPr>
+        <w:t xml:space="preserve"> </w:t>
+      </w:r>
+      <w:hyperlink r:id="rId23" w:history="1">
+        <w:r>
+          <w:rPr>
+            <w:rStyle w:val="Hyperlink"/>
+            <w:rFonts w:ascii="Segoe UI" w:hAnsi="Segoe UI" w:cs="Segoe UI"/>
+            <w:sz w:val="24"/>
+            <w:szCs w:val="24"/>
+            <w:lang w:val="en-US"/>
+          </w:rPr>
+          <w:t>https://www.youtube.com/watch?v=Nw3UohhcPO0&amp;list=PLVz2XdJiJQxwS0BZUHX34ocLTJtRGSQzN&amp;index=1</w:t>
+        </w:r>
+      </w:hyperlink>
+    </w:p>
+    <w:p>
+      <w:pPr>
+        <w:ind w:left="360"/>
+        <w:rPr>
+          <w:rFonts w:ascii="Segoe UI" w:hAnsi="Segoe UI" w:cs="Segoe UI"/>
+          <w:sz w:val="24"/>
+          <w:szCs w:val="24"/>
+          <w:lang w:val="en-US"/>
+        </w:rPr>
+      </w:pPr>
+    </w:p>
+    <w:p>
+      <w:pPr>
+        <w:ind w:left="360"/>
+        <w:rPr>
+          <w:rFonts w:ascii="Segoe UI" w:hAnsi="Segoe UI" w:cs="Segoe UI"/>
+          <w:sz w:val="24"/>
+          <w:szCs w:val="24"/>
+          <w:lang w:val="en-US"/>
+        </w:rPr>
+      </w:pPr>
+      <w:r>
+        <w:rPr>
+          <w:rFonts w:ascii="Segoe UI" w:hAnsi="Segoe UI" w:cs="Segoe UI"/>
+          <w:sz w:val="24"/>
+          <w:szCs w:val="24"/>
+          <w:lang w:val="en-US"/>
+        </w:rPr>
+        <w:t xml:space="preserve">java -jar </w:t>
+      </w:r>
+      <w:proofErr w:type="spellStart"/>
+      <w:r>
+        <w:rPr>
+          <w:rFonts w:ascii="Segoe UI" w:hAnsi="Segoe UI" w:cs="Segoe UI"/>
+          <w:sz w:val="24"/>
+          <w:szCs w:val="24"/>
+          <w:lang w:val="en-US"/>
+        </w:rPr>
+        <w:t>jenkins.war</w:t>
+      </w:r>
       <w:bookmarkStart w:id="0" w:name="_GoBack"/>
       <w:bookmarkEnd w:id="0"/>
+      <w:proofErr w:type="spellEnd"/>
+    </w:p>
+    <w:p>
+      <w:pPr>
+        <w:ind w:left="360"/>
+        <w:rPr>
+          <w:rFonts w:ascii="Segoe UI" w:hAnsi="Segoe UI" w:cs="Segoe UI"/>
+          <w:sz w:val="24"/>
+          <w:szCs w:val="24"/>
+          <w:lang w:val="en-US"/>
+        </w:rPr>
+      </w:pPr>
+      <w:r>
+        <w:rPr>
+          <w:noProof/>
+          <w:lang w:eastAsia="en-IN"/>
+        </w:rPr>
+        <w:lastRenderedPageBreak/>
+        <w:drawing>
+          <wp:inline distT="0" distB="0" distL="0" distR="0" wp14:anchorId="3F2F0E45" wp14:editId="7C4C1EF0">
+            <wp:extent cx="5731510" cy="3222625"/>
+            <wp:effectExtent l="0" t="0" r="2540" b="0"/>
+            <wp:docPr id="18" name="Picture 18"/>
+            <wp:cNvGraphicFramePr>
+              <a:graphicFrameLocks xmlns:a="http://schemas.openxmlformats.org/drawingml/2006/main" noChangeAspect="1"/>
+            </wp:cNvGraphicFramePr>
+            <a:graphic xmlns:a="http://schemas.openxmlformats.org/drawingml/2006/main">
+              <a:graphicData uri="http://schemas.openxmlformats.org/drawingml/2006/picture">
+                <pic:pic xmlns:pic="http://schemas.openxmlformats.org/drawingml/2006/picture">
+                  <pic:nvPicPr>
+                    <pic:cNvPr id="1" name=""/>
+                    <pic:cNvPicPr/>
+                  </pic:nvPicPr>
+                  <pic:blipFill>
+                    <a:blip r:embed="rId24"/>
+                    <a:stretch>
+                      <a:fillRect/>
+                    </a:stretch>
+                  </pic:blipFill>
+                  <pic:spPr>
+                    <a:xfrm>
+                      <a:off x="0" y="0"/>
+                      <a:ext cx="5731510" cy="3222625"/>
+                    </a:xfrm>
+                    <a:prstGeom prst="rect">
+                      <a:avLst/>
+                    </a:prstGeom>
+                  </pic:spPr>
+                </pic:pic>
+              </a:graphicData>
+            </a:graphic>
+          </wp:inline>
+        </w:drawing>
+      </w:r>
+    </w:p>
+    <w:p>
+      <w:pPr>
+        <w:ind w:left="360"/>
+        <w:rPr>
+          <w:rFonts w:ascii="Segoe UI" w:hAnsi="Segoe UI" w:cs="Segoe UI"/>
+          <w:b/>
+          <w:sz w:val="24"/>
+          <w:szCs w:val="24"/>
+          <w:lang w:val="en-US"/>
+        </w:rPr>
+      </w:pPr>
     </w:p>
     <w:sectPr>
       <w:pgSz w:w="11906" w:h="16838"/>

</xml_diff>

<commit_message>
Information documentation is updated
</commit_message>
<xml_diff>
--- a/Information.docx
+++ b/Information.docx
@@ -4166,50 +4166,6 @@
           <w:lang w:val="en-US"/>
         </w:rPr>
       </w:pPr>
-    </w:p>
-    <w:p>
-      <w:pPr>
-        <w:ind w:left="360"/>
-        <w:rPr>
-          <w:rFonts w:ascii="Segoe UI" w:hAnsi="Segoe UI" w:cs="Segoe UI"/>
-          <w:sz w:val="24"/>
-          <w:szCs w:val="24"/>
-          <w:lang w:val="en-US"/>
-        </w:rPr>
-      </w:pPr>
-      <w:r>
-        <w:rPr>
-          <w:rFonts w:ascii="Segoe UI" w:hAnsi="Segoe UI" w:cs="Segoe UI"/>
-          <w:sz w:val="24"/>
-          <w:szCs w:val="24"/>
-          <w:lang w:val="en-US"/>
-        </w:rPr>
-        <w:t xml:space="preserve">java -jar </w:t>
-      </w:r>
-      <w:proofErr w:type="spellStart"/>
-      <w:r>
-        <w:rPr>
-          <w:rFonts w:ascii="Segoe UI" w:hAnsi="Segoe UI" w:cs="Segoe UI"/>
-          <w:sz w:val="24"/>
-          <w:szCs w:val="24"/>
-          <w:lang w:val="en-US"/>
-        </w:rPr>
-        <w:t>jenkins.war</w:t>
-      </w:r>
-      <w:bookmarkStart w:id="0" w:name="_GoBack"/>
-      <w:bookmarkEnd w:id="0"/>
-      <w:proofErr w:type="spellEnd"/>
-    </w:p>
-    <w:p>
-      <w:pPr>
-        <w:ind w:left="360"/>
-        <w:rPr>
-          <w:rFonts w:ascii="Segoe UI" w:hAnsi="Segoe UI" w:cs="Segoe UI"/>
-          <w:sz w:val="24"/>
-          <w:szCs w:val="24"/>
-          <w:lang w:val="en-US"/>
-        </w:rPr>
-      </w:pPr>
       <w:r>
         <w:rPr>
           <w:noProof/>
@@ -4217,10 +4173,10 @@
         </w:rPr>
         <w:lastRenderedPageBreak/>
         <w:drawing>
-          <wp:inline distT="0" distB="0" distL="0" distR="0" wp14:anchorId="3F2F0E45" wp14:editId="7C4C1EF0">
-            <wp:extent cx="5731510" cy="3222625"/>
-            <wp:effectExtent l="0" t="0" r="2540" b="0"/>
-            <wp:docPr id="18" name="Picture 18"/>
+          <wp:inline distT="0" distB="0" distL="0" distR="0" wp14:anchorId="395B1CD9" wp14:editId="19CC3559">
+            <wp:extent cx="5731510" cy="2964180"/>
+            <wp:effectExtent l="0" t="0" r="2540" b="7620"/>
+            <wp:docPr id="20" name="Picture 20"/>
             <wp:cNvGraphicFramePr>
               <a:graphicFrameLocks xmlns:a="http://schemas.openxmlformats.org/drawingml/2006/main" noChangeAspect="1"/>
             </wp:cNvGraphicFramePr>
@@ -4240,7 +4196,742 @@
                   <pic:spPr>
                     <a:xfrm>
                       <a:off x="0" y="0"/>
+                      <a:ext cx="5731510" cy="2964180"/>
+                    </a:xfrm>
+                    <a:prstGeom prst="rect">
+                      <a:avLst/>
+                    </a:prstGeom>
+                  </pic:spPr>
+                </pic:pic>
+              </a:graphicData>
+            </a:graphic>
+          </wp:inline>
+        </w:drawing>
+      </w:r>
+    </w:p>
+    <w:p>
+      <w:pPr>
+        <w:ind w:left="360"/>
+        <w:rPr>
+          <w:rFonts w:ascii="Segoe UI" w:hAnsi="Segoe UI" w:cs="Segoe UI"/>
+          <w:sz w:val="24"/>
+          <w:szCs w:val="24"/>
+          <w:lang w:val="en-US"/>
+        </w:rPr>
+      </w:pPr>
+    </w:p>
+    <w:p>
+      <w:pPr>
+        <w:ind w:left="360"/>
+        <w:rPr>
+          <w:rFonts w:ascii="Segoe UI" w:hAnsi="Segoe UI" w:cs="Segoe UI"/>
+          <w:sz w:val="24"/>
+          <w:szCs w:val="24"/>
+          <w:lang w:val="en-US"/>
+        </w:rPr>
+      </w:pPr>
+      <w:proofErr w:type="gramStart"/>
+      <w:r>
+        <w:rPr>
+          <w:rFonts w:ascii="Segoe UI" w:hAnsi="Segoe UI" w:cs="Segoe UI"/>
+          <w:sz w:val="24"/>
+          <w:szCs w:val="24"/>
+          <w:lang w:val="en-US"/>
+        </w:rPr>
+        <w:t>java</w:t>
+      </w:r>
+      <w:proofErr w:type="gramEnd"/>
+      <w:r>
+        <w:rPr>
+          <w:rFonts w:ascii="Segoe UI" w:hAnsi="Segoe UI" w:cs="Segoe UI"/>
+          <w:sz w:val="24"/>
+          <w:szCs w:val="24"/>
+          <w:lang w:val="en-US"/>
+        </w:rPr>
+        <w:t xml:space="preserve"> -jar </w:t>
+      </w:r>
+      <w:proofErr w:type="spellStart"/>
+      <w:r>
+        <w:rPr>
+          <w:rFonts w:ascii="Segoe UI" w:hAnsi="Segoe UI" w:cs="Segoe UI"/>
+          <w:sz w:val="24"/>
+          <w:szCs w:val="24"/>
+          <w:lang w:val="en-US"/>
+        </w:rPr>
+        <w:t>jenkins.war</w:t>
+      </w:r>
+      <w:proofErr w:type="spellEnd"/>
+    </w:p>
+    <w:p>
+      <w:pPr>
+        <w:ind w:left="360"/>
+        <w:rPr>
+          <w:rFonts w:ascii="Segoe UI" w:hAnsi="Segoe UI" w:cs="Segoe UI"/>
+          <w:sz w:val="24"/>
+          <w:szCs w:val="24"/>
+          <w:lang w:val="en-US"/>
+        </w:rPr>
+      </w:pPr>
+      <w:r>
+        <w:rPr>
+          <w:noProof/>
+          <w:lang w:eastAsia="en-IN"/>
+        </w:rPr>
+        <w:drawing>
+          <wp:inline distT="0" distB="0" distL="0" distR="0" wp14:anchorId="3F2F0E45" wp14:editId="7C4C1EF0">
+            <wp:extent cx="5731510" cy="3222625"/>
+            <wp:effectExtent l="0" t="0" r="2540" b="0"/>
+            <wp:docPr id="18" name="Picture 18"/>
+            <wp:cNvGraphicFramePr>
+              <a:graphicFrameLocks xmlns:a="http://schemas.openxmlformats.org/drawingml/2006/main" noChangeAspect="1"/>
+            </wp:cNvGraphicFramePr>
+            <a:graphic xmlns:a="http://schemas.openxmlformats.org/drawingml/2006/main">
+              <a:graphicData uri="http://schemas.openxmlformats.org/drawingml/2006/picture">
+                <pic:pic xmlns:pic="http://schemas.openxmlformats.org/drawingml/2006/picture">
+                  <pic:nvPicPr>
+                    <pic:cNvPr id="1" name=""/>
+                    <pic:cNvPicPr/>
+                  </pic:nvPicPr>
+                  <pic:blipFill>
+                    <a:blip r:embed="rId25"/>
+                    <a:stretch>
+                      <a:fillRect/>
+                    </a:stretch>
+                  </pic:blipFill>
+                  <pic:spPr>
+                    <a:xfrm>
+                      <a:off x="0" y="0"/>
                       <a:ext cx="5731510" cy="3222625"/>
+                    </a:xfrm>
+                    <a:prstGeom prst="rect">
+                      <a:avLst/>
+                    </a:prstGeom>
+                  </pic:spPr>
+                </pic:pic>
+              </a:graphicData>
+            </a:graphic>
+          </wp:inline>
+        </w:drawing>
+      </w:r>
+    </w:p>
+    <w:p>
+      <w:pPr>
+        <w:ind w:left="360"/>
+        <w:rPr>
+          <w:rFonts w:ascii="Segoe UI" w:hAnsi="Segoe UI" w:cs="Segoe UI"/>
+          <w:sz w:val="24"/>
+          <w:szCs w:val="24"/>
+          <w:lang w:val="en-US"/>
+        </w:rPr>
+      </w:pPr>
+    </w:p>
+    <w:p>
+      <w:pPr>
+        <w:ind w:left="360"/>
+        <w:rPr>
+          <w:rFonts w:ascii="Segoe UI" w:hAnsi="Segoe UI" w:cs="Segoe UI"/>
+          <w:sz w:val="24"/>
+          <w:szCs w:val="24"/>
+          <w:lang w:val="en-US"/>
+        </w:rPr>
+      </w:pPr>
+      <w:r>
+        <w:rPr>
+          <w:noProof/>
+          <w:lang w:eastAsia="en-IN"/>
+        </w:rPr>
+        <w:lastRenderedPageBreak/>
+        <w:drawing>
+          <wp:inline distT="0" distB="0" distL="0" distR="0" wp14:anchorId="072927E8" wp14:editId="1E7B2B91">
+            <wp:extent cx="5731510" cy="3222625"/>
+            <wp:effectExtent l="0" t="0" r="2540" b="0"/>
+            <wp:docPr id="19" name="Picture 19"/>
+            <wp:cNvGraphicFramePr>
+              <a:graphicFrameLocks xmlns:a="http://schemas.openxmlformats.org/drawingml/2006/main" noChangeAspect="1"/>
+            </wp:cNvGraphicFramePr>
+            <a:graphic xmlns:a="http://schemas.openxmlformats.org/drawingml/2006/main">
+              <a:graphicData uri="http://schemas.openxmlformats.org/drawingml/2006/picture">
+                <pic:pic xmlns:pic="http://schemas.openxmlformats.org/drawingml/2006/picture">
+                  <pic:nvPicPr>
+                    <pic:cNvPr id="1" name=""/>
+                    <pic:cNvPicPr/>
+                  </pic:nvPicPr>
+                  <pic:blipFill>
+                    <a:blip r:embed="rId26"/>
+                    <a:stretch>
+                      <a:fillRect/>
+                    </a:stretch>
+                  </pic:blipFill>
+                  <pic:spPr>
+                    <a:xfrm>
+                      <a:off x="0" y="0"/>
+                      <a:ext cx="5731510" cy="3222625"/>
+                    </a:xfrm>
+                    <a:prstGeom prst="rect">
+                      <a:avLst/>
+                    </a:prstGeom>
+                  </pic:spPr>
+                </pic:pic>
+              </a:graphicData>
+            </a:graphic>
+          </wp:inline>
+        </w:drawing>
+      </w:r>
+    </w:p>
+    <w:p>
+      <w:pPr>
+        <w:ind w:left="360"/>
+        <w:rPr>
+          <w:rFonts w:ascii="Segoe UI" w:hAnsi="Segoe UI" w:cs="Segoe UI"/>
+          <w:sz w:val="24"/>
+          <w:szCs w:val="24"/>
+          <w:lang w:val="en-US"/>
+        </w:rPr>
+      </w:pPr>
+    </w:p>
+    <w:p>
+      <w:pPr>
+        <w:ind w:left="360"/>
+        <w:rPr>
+          <w:rFonts w:ascii="Segoe UI" w:hAnsi="Segoe UI" w:cs="Segoe UI"/>
+          <w:sz w:val="24"/>
+          <w:szCs w:val="24"/>
+          <w:lang w:val="en-US"/>
+        </w:rPr>
+      </w:pPr>
+      <w:r>
+        <w:rPr>
+          <w:rFonts w:ascii="Segoe UI" w:hAnsi="Segoe UI" w:cs="Segoe UI"/>
+          <w:sz w:val="24"/>
+          <w:szCs w:val="24"/>
+          <w:lang w:val="en-US"/>
+        </w:rPr>
+        <w:t>Once installed from next time onwards it will ask for username and password</w:t>
+      </w:r>
+      <w:proofErr w:type="gramStart"/>
+      <w:r>
+        <w:rPr>
+          <w:rFonts w:ascii="Segoe UI" w:hAnsi="Segoe UI" w:cs="Segoe UI"/>
+          <w:sz w:val="24"/>
+          <w:szCs w:val="24"/>
+          <w:lang w:val="en-US"/>
+        </w:rPr>
+        <w:t>..</w:t>
+      </w:r>
+      <w:proofErr w:type="gramEnd"/>
+    </w:p>
+    <w:p>
+      <w:pPr>
+        <w:ind w:left="360"/>
+        <w:rPr>
+          <w:rFonts w:ascii="Segoe UI" w:hAnsi="Segoe UI" w:cs="Segoe UI"/>
+          <w:sz w:val="24"/>
+          <w:szCs w:val="24"/>
+          <w:lang w:val="en-US"/>
+        </w:rPr>
+      </w:pPr>
+      <w:r>
+        <w:rPr>
+          <w:rFonts w:ascii="Segoe UI" w:hAnsi="Segoe UI" w:cs="Segoe UI"/>
+          <w:sz w:val="24"/>
+          <w:szCs w:val="24"/>
+          <w:lang w:val="en-US"/>
+        </w:rPr>
+        <w:t xml:space="preserve">Username – </w:t>
+      </w:r>
+      <w:proofErr w:type="spellStart"/>
+      <w:r>
+        <w:rPr>
+          <w:rFonts w:ascii="Segoe UI" w:hAnsi="Segoe UI" w:cs="Segoe UI"/>
+          <w:sz w:val="24"/>
+          <w:szCs w:val="24"/>
+          <w:lang w:val="en-US"/>
+        </w:rPr>
+        <w:t>omkar</w:t>
+      </w:r>
+      <w:proofErr w:type="spellEnd"/>
+      <w:r>
+        <w:rPr>
+          <w:rFonts w:ascii="Segoe UI" w:hAnsi="Segoe UI" w:cs="Segoe UI"/>
+          <w:sz w:val="24"/>
+          <w:szCs w:val="24"/>
+          <w:lang w:val="en-US"/>
+        </w:rPr>
+        <w:t xml:space="preserve"> </w:t>
+      </w:r>
+    </w:p>
+    <w:p>
+      <w:pPr>
+        <w:ind w:left="360"/>
+        <w:rPr>
+          <w:rFonts w:ascii="Segoe UI" w:hAnsi="Segoe UI" w:cs="Segoe UI"/>
+          <w:sz w:val="24"/>
+          <w:szCs w:val="24"/>
+          <w:lang w:val="en-US"/>
+        </w:rPr>
+      </w:pPr>
+      <w:r>
+        <w:rPr>
+          <w:rFonts w:ascii="Segoe UI" w:hAnsi="Segoe UI" w:cs="Segoe UI"/>
+          <w:sz w:val="24"/>
+          <w:szCs w:val="24"/>
+          <w:lang w:val="en-US"/>
+        </w:rPr>
+        <w:t xml:space="preserve">Password – </w:t>
+      </w:r>
+      <w:proofErr w:type="spellStart"/>
+      <w:r>
+        <w:rPr>
+          <w:rFonts w:ascii="Segoe UI" w:hAnsi="Segoe UI" w:cs="Segoe UI"/>
+          <w:sz w:val="24"/>
+          <w:szCs w:val="24"/>
+          <w:lang w:val="en-US"/>
+        </w:rPr>
+        <w:t>omkar</w:t>
+      </w:r>
+      <w:proofErr w:type="spellEnd"/>
+    </w:p>
+    <w:p>
+      <w:pPr>
+        <w:ind w:left="360"/>
+        <w:rPr>
+          <w:rFonts w:ascii="Segoe UI" w:hAnsi="Segoe UI" w:cs="Segoe UI"/>
+          <w:sz w:val="24"/>
+          <w:szCs w:val="24"/>
+          <w:lang w:val="en-US"/>
+        </w:rPr>
+      </w:pPr>
+      <w:r>
+        <w:rPr>
+          <w:noProof/>
+          <w:lang w:eastAsia="en-IN"/>
+        </w:rPr>
+        <w:drawing>
+          <wp:inline distT="0" distB="0" distL="0" distR="0" wp14:anchorId="356556F7" wp14:editId="32869A4D">
+            <wp:extent cx="5731510" cy="3222625"/>
+            <wp:effectExtent l="0" t="0" r="2540" b="0"/>
+            <wp:docPr id="21" name="Picture 21"/>
+            <wp:cNvGraphicFramePr>
+              <a:graphicFrameLocks xmlns:a="http://schemas.openxmlformats.org/drawingml/2006/main" noChangeAspect="1"/>
+            </wp:cNvGraphicFramePr>
+            <a:graphic xmlns:a="http://schemas.openxmlformats.org/drawingml/2006/main">
+              <a:graphicData uri="http://schemas.openxmlformats.org/drawingml/2006/picture">
+                <pic:pic xmlns:pic="http://schemas.openxmlformats.org/drawingml/2006/picture">
+                  <pic:nvPicPr>
+                    <pic:cNvPr id="1" name=""/>
+                    <pic:cNvPicPr/>
+                  </pic:nvPicPr>
+                  <pic:blipFill>
+                    <a:blip r:embed="rId27"/>
+                    <a:stretch>
+                      <a:fillRect/>
+                    </a:stretch>
+                  </pic:blipFill>
+                  <pic:spPr>
+                    <a:xfrm>
+                      <a:off x="0" y="0"/>
+                      <a:ext cx="5731510" cy="3222625"/>
+                    </a:xfrm>
+                    <a:prstGeom prst="rect">
+                      <a:avLst/>
+                    </a:prstGeom>
+                  </pic:spPr>
+                </pic:pic>
+              </a:graphicData>
+            </a:graphic>
+          </wp:inline>
+        </w:drawing>
+      </w:r>
+    </w:p>
+    <w:p>
+      <w:pPr>
+        <w:ind w:left="360"/>
+        <w:rPr>
+          <w:rFonts w:ascii="Segoe UI" w:hAnsi="Segoe UI" w:cs="Segoe UI"/>
+          <w:sz w:val="24"/>
+          <w:szCs w:val="24"/>
+          <w:lang w:val="en-US"/>
+        </w:rPr>
+      </w:pPr>
+    </w:p>
+    <w:p>
+      <w:pPr>
+        <w:ind w:left="360"/>
+        <w:rPr>
+          <w:rFonts w:ascii="Segoe UI" w:hAnsi="Segoe UI" w:cs="Segoe UI"/>
+          <w:sz w:val="24"/>
+          <w:szCs w:val="24"/>
+          <w:lang w:val="en-US"/>
+        </w:rPr>
+      </w:pPr>
+      <w:r>
+        <w:rPr>
+          <w:noProof/>
+          <w:lang w:eastAsia="en-IN"/>
+        </w:rPr>
+        <w:lastRenderedPageBreak/>
+        <w:drawing>
+          <wp:inline distT="0" distB="0" distL="0" distR="0" wp14:anchorId="3DCB0234" wp14:editId="3AC5CA6A">
+            <wp:extent cx="5731510" cy="3222625"/>
+            <wp:effectExtent l="0" t="0" r="2540" b="0"/>
+            <wp:docPr id="22" name="Picture 22"/>
+            <wp:cNvGraphicFramePr>
+              <a:graphicFrameLocks xmlns:a="http://schemas.openxmlformats.org/drawingml/2006/main" noChangeAspect="1"/>
+            </wp:cNvGraphicFramePr>
+            <a:graphic xmlns:a="http://schemas.openxmlformats.org/drawingml/2006/main">
+              <a:graphicData uri="http://schemas.openxmlformats.org/drawingml/2006/picture">
+                <pic:pic xmlns:pic="http://schemas.openxmlformats.org/drawingml/2006/picture">
+                  <pic:nvPicPr>
+                    <pic:cNvPr id="1" name=""/>
+                    <pic:cNvPicPr/>
+                  </pic:nvPicPr>
+                  <pic:blipFill>
+                    <a:blip r:embed="rId28"/>
+                    <a:stretch>
+                      <a:fillRect/>
+                    </a:stretch>
+                  </pic:blipFill>
+                  <pic:spPr>
+                    <a:xfrm>
+                      <a:off x="0" y="0"/>
+                      <a:ext cx="5731510" cy="3222625"/>
+                    </a:xfrm>
+                    <a:prstGeom prst="rect">
+                      <a:avLst/>
+                    </a:prstGeom>
+                  </pic:spPr>
+                </pic:pic>
+              </a:graphicData>
+            </a:graphic>
+          </wp:inline>
+        </w:drawing>
+      </w:r>
+    </w:p>
+    <w:p>
+      <w:pPr>
+        <w:ind w:left="360"/>
+        <w:rPr>
+          <w:rFonts w:ascii="Segoe UI" w:hAnsi="Segoe UI" w:cs="Segoe UI"/>
+          <w:sz w:val="24"/>
+          <w:szCs w:val="24"/>
+          <w:lang w:val="en-US"/>
+        </w:rPr>
+      </w:pPr>
+      <w:r>
+        <w:rPr>
+          <w:noProof/>
+          <w:lang w:eastAsia="en-IN"/>
+        </w:rPr>
+        <w:drawing>
+          <wp:inline distT="0" distB="0" distL="0" distR="0" wp14:anchorId="5A962A0B" wp14:editId="73543F61">
+            <wp:extent cx="5553075" cy="3543300"/>
+            <wp:effectExtent l="0" t="0" r="9525" b="0"/>
+            <wp:docPr id="24" name="Picture 24"/>
+            <wp:cNvGraphicFramePr>
+              <a:graphicFrameLocks xmlns:a="http://schemas.openxmlformats.org/drawingml/2006/main" noChangeAspect="1"/>
+            </wp:cNvGraphicFramePr>
+            <a:graphic xmlns:a="http://schemas.openxmlformats.org/drawingml/2006/main">
+              <a:graphicData uri="http://schemas.openxmlformats.org/drawingml/2006/picture">
+                <pic:pic xmlns:pic="http://schemas.openxmlformats.org/drawingml/2006/picture">
+                  <pic:nvPicPr>
+                    <pic:cNvPr id="1" name=""/>
+                    <pic:cNvPicPr/>
+                  </pic:nvPicPr>
+                  <pic:blipFill>
+                    <a:blip r:embed="rId29"/>
+                    <a:stretch>
+                      <a:fillRect/>
+                    </a:stretch>
+                  </pic:blipFill>
+                  <pic:spPr>
+                    <a:xfrm>
+                      <a:off x="0" y="0"/>
+                      <a:ext cx="5553075" cy="3543300"/>
+                    </a:xfrm>
+                    <a:prstGeom prst="rect">
+                      <a:avLst/>
+                    </a:prstGeom>
+                  </pic:spPr>
+                </pic:pic>
+              </a:graphicData>
+            </a:graphic>
+          </wp:inline>
+        </w:drawing>
+      </w:r>
+    </w:p>
+    <w:p>
+      <w:pPr>
+        <w:ind w:left="360"/>
+        <w:rPr>
+          <w:rFonts w:ascii="Segoe UI" w:hAnsi="Segoe UI" w:cs="Segoe UI"/>
+          <w:sz w:val="24"/>
+          <w:szCs w:val="24"/>
+          <w:lang w:val="en-US"/>
+        </w:rPr>
+      </w:pPr>
+      <w:r>
+        <w:rPr>
+          <w:noProof/>
+          <w:lang w:eastAsia="en-IN"/>
+        </w:rPr>
+        <w:lastRenderedPageBreak/>
+        <w:drawing>
+          <wp:inline distT="0" distB="0" distL="0" distR="0" wp14:anchorId="4CB49A97" wp14:editId="1BC3F331">
+            <wp:extent cx="5731510" cy="3222625"/>
+            <wp:effectExtent l="0" t="0" r="2540" b="0"/>
+            <wp:docPr id="25" name="Picture 25"/>
+            <wp:cNvGraphicFramePr>
+              <a:graphicFrameLocks xmlns:a="http://schemas.openxmlformats.org/drawingml/2006/main" noChangeAspect="1"/>
+            </wp:cNvGraphicFramePr>
+            <a:graphic xmlns:a="http://schemas.openxmlformats.org/drawingml/2006/main">
+              <a:graphicData uri="http://schemas.openxmlformats.org/drawingml/2006/picture">
+                <pic:pic xmlns:pic="http://schemas.openxmlformats.org/drawingml/2006/picture">
+                  <pic:nvPicPr>
+                    <pic:cNvPr id="1" name=""/>
+                    <pic:cNvPicPr/>
+                  </pic:nvPicPr>
+                  <pic:blipFill>
+                    <a:blip r:embed="rId30"/>
+                    <a:stretch>
+                      <a:fillRect/>
+                    </a:stretch>
+                  </pic:blipFill>
+                  <pic:spPr>
+                    <a:xfrm>
+                      <a:off x="0" y="0"/>
+                      <a:ext cx="5731510" cy="3222625"/>
+                    </a:xfrm>
+                    <a:prstGeom prst="rect">
+                      <a:avLst/>
+                    </a:prstGeom>
+                  </pic:spPr>
+                </pic:pic>
+              </a:graphicData>
+            </a:graphic>
+          </wp:inline>
+        </w:drawing>
+      </w:r>
+    </w:p>
+    <w:p>
+      <w:pPr>
+        <w:ind w:left="360"/>
+        <w:rPr>
+          <w:rFonts w:ascii="Segoe UI" w:hAnsi="Segoe UI" w:cs="Segoe UI"/>
+          <w:sz w:val="24"/>
+          <w:szCs w:val="24"/>
+          <w:lang w:val="en-US"/>
+        </w:rPr>
+      </w:pPr>
+    </w:p>
+    <w:p>
+      <w:pPr>
+        <w:ind w:left="360"/>
+        <w:rPr>
+          <w:rFonts w:ascii="Segoe UI" w:hAnsi="Segoe UI" w:cs="Segoe UI"/>
+          <w:sz w:val="24"/>
+          <w:szCs w:val="24"/>
+          <w:lang w:val="en-US"/>
+        </w:rPr>
+      </w:pPr>
+      <w:r>
+        <w:rPr>
+          <w:noProof/>
+          <w:lang w:eastAsia="en-IN"/>
+        </w:rPr>
+        <w:drawing>
+          <wp:inline distT="0" distB="0" distL="0" distR="0" wp14:anchorId="45AE0AEE" wp14:editId="2D9A53C5">
+            <wp:extent cx="5731510" cy="2976245"/>
+            <wp:effectExtent l="0" t="0" r="2540" b="0"/>
+            <wp:docPr id="26" name="Picture 26"/>
+            <wp:cNvGraphicFramePr>
+              <a:graphicFrameLocks xmlns:a="http://schemas.openxmlformats.org/drawingml/2006/main" noChangeAspect="1"/>
+            </wp:cNvGraphicFramePr>
+            <a:graphic xmlns:a="http://schemas.openxmlformats.org/drawingml/2006/main">
+              <a:graphicData uri="http://schemas.openxmlformats.org/drawingml/2006/picture">
+                <pic:pic xmlns:pic="http://schemas.openxmlformats.org/drawingml/2006/picture">
+                  <pic:nvPicPr>
+                    <pic:cNvPr id="1" name=""/>
+                    <pic:cNvPicPr/>
+                  </pic:nvPicPr>
+                  <pic:blipFill>
+                    <a:blip r:embed="rId31"/>
+                    <a:stretch>
+                      <a:fillRect/>
+                    </a:stretch>
+                  </pic:blipFill>
+                  <pic:spPr>
+                    <a:xfrm>
+                      <a:off x="0" y="0"/>
+                      <a:ext cx="5731510" cy="2976245"/>
+                    </a:xfrm>
+                    <a:prstGeom prst="rect">
+                      <a:avLst/>
+                    </a:prstGeom>
+                  </pic:spPr>
+                </pic:pic>
+              </a:graphicData>
+            </a:graphic>
+          </wp:inline>
+        </w:drawing>
+      </w:r>
+    </w:p>
+    <w:p>
+      <w:pPr>
+        <w:ind w:left="360"/>
+        <w:rPr>
+          <w:rFonts w:ascii="Segoe UI" w:hAnsi="Segoe UI" w:cs="Segoe UI"/>
+          <w:sz w:val="24"/>
+          <w:szCs w:val="24"/>
+          <w:lang w:val="en-US"/>
+        </w:rPr>
+      </w:pPr>
+      <w:r>
+        <w:rPr>
+          <w:rFonts w:ascii="Segoe UI" w:hAnsi="Segoe UI" w:cs="Segoe UI"/>
+          <w:sz w:val="24"/>
+          <w:szCs w:val="24"/>
+          <w:lang w:val="en-US"/>
+        </w:rPr>
+        <w:t xml:space="preserve">Build no 8 is automatically </w:t>
+      </w:r>
+      <w:r>
+        <w:rPr>
+          <w:rFonts w:ascii="Segoe UI" w:hAnsi="Segoe UI" w:cs="Segoe UI"/>
+          <w:sz w:val="24"/>
+          <w:szCs w:val="24"/>
+          <w:lang w:val="en-US"/>
+        </w:rPr>
+        <w:t>triggered</w:t>
+      </w:r>
+      <w:bookmarkStart w:id="0" w:name="_GoBack"/>
+      <w:bookmarkEnd w:id="0"/>
+      <w:proofErr w:type="gramStart"/>
+      <w:r>
+        <w:rPr>
+          <w:rFonts w:ascii="Segoe UI" w:hAnsi="Segoe UI" w:cs="Segoe UI"/>
+          <w:sz w:val="24"/>
+          <w:szCs w:val="24"/>
+          <w:lang w:val="en-US"/>
+        </w:rPr>
+        <w:t>..</w:t>
+      </w:r>
+      <w:proofErr w:type="gramEnd"/>
+    </w:p>
+    <w:p>
+      <w:pPr>
+        <w:ind w:left="360"/>
+        <w:rPr>
+          <w:rFonts w:ascii="Segoe UI" w:hAnsi="Segoe UI" w:cs="Segoe UI"/>
+          <w:sz w:val="24"/>
+          <w:szCs w:val="24"/>
+          <w:lang w:val="en-US"/>
+        </w:rPr>
+      </w:pPr>
+    </w:p>
+    <w:p>
+      <w:pPr>
+        <w:ind w:left="360"/>
+        <w:rPr>
+          <w:rFonts w:ascii="Segoe UI" w:hAnsi="Segoe UI" w:cs="Segoe UI"/>
+          <w:sz w:val="24"/>
+          <w:szCs w:val="24"/>
+          <w:lang w:val="en-US"/>
+        </w:rPr>
+      </w:pPr>
+      <w:r>
+        <w:rPr>
+          <w:noProof/>
+          <w:lang w:eastAsia="en-IN"/>
+        </w:rPr>
+        <w:lastRenderedPageBreak/>
+        <w:drawing>
+          <wp:inline distT="0" distB="0" distL="0" distR="0" wp14:anchorId="7F7832D2" wp14:editId="0F732CD5">
+            <wp:extent cx="5731510" cy="3222625"/>
+            <wp:effectExtent l="0" t="0" r="2540" b="0"/>
+            <wp:docPr id="23" name="Picture 23"/>
+            <wp:cNvGraphicFramePr>
+              <a:graphicFrameLocks xmlns:a="http://schemas.openxmlformats.org/drawingml/2006/main" noChangeAspect="1"/>
+            </wp:cNvGraphicFramePr>
+            <a:graphic xmlns:a="http://schemas.openxmlformats.org/drawingml/2006/main">
+              <a:graphicData uri="http://schemas.openxmlformats.org/drawingml/2006/picture">
+                <pic:pic xmlns:pic="http://schemas.openxmlformats.org/drawingml/2006/picture">
+                  <pic:nvPicPr>
+                    <pic:cNvPr id="1" name=""/>
+                    <pic:cNvPicPr/>
+                  </pic:nvPicPr>
+                  <pic:blipFill>
+                    <a:blip r:embed="rId32"/>
+                    <a:stretch>
+                      <a:fillRect/>
+                    </a:stretch>
+                  </pic:blipFill>
+                  <pic:spPr>
+                    <a:xfrm>
+                      <a:off x="0" y="0"/>
+                      <a:ext cx="5731510" cy="3222625"/>
+                    </a:xfrm>
+                    <a:prstGeom prst="rect">
+                      <a:avLst/>
+                    </a:prstGeom>
+                  </pic:spPr>
+                </pic:pic>
+              </a:graphicData>
+            </a:graphic>
+          </wp:inline>
+        </w:drawing>
+      </w:r>
+    </w:p>
+    <w:p>
+      <w:pPr>
+        <w:ind w:left="360"/>
+        <w:rPr>
+          <w:rFonts w:ascii="Segoe UI" w:hAnsi="Segoe UI" w:cs="Segoe UI"/>
+          <w:sz w:val="24"/>
+          <w:szCs w:val="24"/>
+          <w:lang w:val="en-US"/>
+        </w:rPr>
+      </w:pPr>
+    </w:p>
+    <w:p>
+      <w:pPr>
+        <w:ind w:left="360"/>
+        <w:rPr>
+          <w:rFonts w:ascii="Segoe UI" w:hAnsi="Segoe UI" w:cs="Segoe UI"/>
+          <w:sz w:val="24"/>
+          <w:szCs w:val="24"/>
+          <w:lang w:val="en-US"/>
+        </w:rPr>
+      </w:pPr>
+      <w:r>
+        <w:rPr>
+          <w:noProof/>
+          <w:lang w:eastAsia="en-IN"/>
+        </w:rPr>
+        <w:drawing>
+          <wp:inline distT="0" distB="0" distL="0" distR="0" wp14:anchorId="15A1DC44" wp14:editId="4AF26493">
+            <wp:extent cx="5731510" cy="3030855"/>
+            <wp:effectExtent l="0" t="0" r="2540" b="0"/>
+            <wp:docPr id="27" name="Picture 27"/>
+            <wp:cNvGraphicFramePr>
+              <a:graphicFrameLocks xmlns:a="http://schemas.openxmlformats.org/drawingml/2006/main" noChangeAspect="1"/>
+            </wp:cNvGraphicFramePr>
+            <a:graphic xmlns:a="http://schemas.openxmlformats.org/drawingml/2006/main">
+              <a:graphicData uri="http://schemas.openxmlformats.org/drawingml/2006/picture">
+                <pic:pic xmlns:pic="http://schemas.openxmlformats.org/drawingml/2006/picture">
+                  <pic:nvPicPr>
+                    <pic:cNvPr id="1" name=""/>
+                    <pic:cNvPicPr/>
+                  </pic:nvPicPr>
+                  <pic:blipFill>
+                    <a:blip r:embed="rId33"/>
+                    <a:stretch>
+                      <a:fillRect/>
+                    </a:stretch>
+                  </pic:blipFill>
+                  <pic:spPr>
+                    <a:xfrm>
+                      <a:off x="0" y="0"/>
+                      <a:ext cx="5731510" cy="3030855"/>
                     </a:xfrm>
                     <a:prstGeom prst="rect">
                       <a:avLst/>

</xml_diff>